<commit_message>
Apply owner-confirmed pair activity and role rotation
</commit_message>
<xml_diff>
--- a/second-placement/planning/chapter-2-marketing-plan/2026-10-14-PEST-Business-Worksheet-v1.docx
+++ b/second-placement/planning/chapter-2-marketing-plan/2026-10-14-PEST-Business-Worksheet-v1.docx
@@ -12,7 +12,7 @@
     </w:p>
     <w:p>
       <w:r>
-        <w:t>Name __________________________   Block ______   Date __________</w:t>
+        <w:t>Partners ___________________ and ___________________   Block ______</w:t>
       </w:r>
     </w:p>
     <w:p>
@@ -28,6 +28,11 @@
     <w:p>
       <w:r>
         <w:t>For each category, give an external factor/example and explain a possible positive (+) and negative (−) impact on your business. Use business terms and complete thoughts. Textbook pp. 19–20 may help.</w:t>
+      </w:r>
+    </w:p>
+    <w:p>
+      <w:r>
+        <w:t>One partner explains; the other records. Switch roles each category. Both explain why.</w:t>
       </w:r>
     </w:p>
     <w:tbl>

</xml_diff>